<commit_message>
Feat: implementazione home page, documentata
</commit_message>
<xml_diff>
--- a/docs/Prototipo - Sotto l'Olmo.docx
+++ b/docs/Prototipo - Sotto l'Olmo.docx
@@ -138,6 +138,7 @@
       <w:r>
         <w:rPr>
           <w:rFonts w:ascii="Times New Roman" w:hAnsi="Times New Roman" w:cs="Times New Roman"/>
+          <w:noProof/>
           <w:sz w:val="36"/>
           <w:szCs w:val="36"/>
         </w:rPr>
@@ -451,6 +452,7 @@
       <w:r>
         <w:rPr>
           <w:rFonts w:ascii="Times New Roman" w:hAnsi="Times New Roman" w:cs="Times New Roman"/>
+          <w:noProof/>
           <w:sz w:val="36"/>
           <w:szCs w:val="36"/>
         </w:rPr>
@@ -822,7 +824,7 @@
           <w:sz w:val="36"/>
           <w:szCs w:val="36"/>
         </w:rPr>
-        <w:t xml:space="preserve"> che vedranno solo gli admin. </w:t>
+        <w:t xml:space="preserve"> che vedranno solo gli admin.</w:t>
       </w:r>
     </w:p>
     <w:p>
@@ -855,6 +857,7 @@
       <w:r>
         <w:rPr>
           <w:rFonts w:ascii="Times New Roman" w:hAnsi="Times New Roman" w:cs="Times New Roman"/>
+          <w:noProof/>
           <w:sz w:val="36"/>
           <w:szCs w:val="36"/>
         </w:rPr>
@@ -991,6 +994,7 @@
       <w:r>
         <w:rPr>
           <w:rFonts w:ascii="Times New Roman" w:hAnsi="Times New Roman" w:cs="Times New Roman"/>
+          <w:noProof/>
           <w:sz w:val="36"/>
           <w:szCs w:val="36"/>
         </w:rPr>
@@ -1127,6 +1131,7 @@
       <w:r>
         <w:rPr>
           <w:rFonts w:ascii="Times New Roman" w:hAnsi="Times New Roman" w:cs="Times New Roman"/>
+          <w:noProof/>
           <w:sz w:val="36"/>
           <w:szCs w:val="36"/>
         </w:rPr>

</xml_diff>